<commit_message>
commit code để deploy product
</commit_message>
<xml_diff>
--- a/my_custom_addons/dl_contract/static/templates/hop_dong/TEMPLATE_HD_MOT_NAM.docx
+++ b/my_custom_addons/dl_contract/static/templates/hop_dong/TEMPLATE_HD_MOT_NAM.docx
@@ -561,7 +561,29 @@
                 <w:sz w:val="27"/>
                 <w:szCs w:val="27"/>
               </w:rPr>
-              <w:t>text_contract_date</w:t>
+              <w:t>text_</w:t>
+            </w:r>
+            <w:r>
+              <w:rPr>
+                <w:rFonts w:ascii="Times New Roman" w:eastAsia="Times New Roman" w:hAnsi="Times New Roman" w:cs="Times New Roman"/>
+                <w:i/>
+                <w:iCs/>
+                <w:color w:val="EE0000"/>
+                <w:sz w:val="27"/>
+                <w:szCs w:val="27"/>
+              </w:rPr>
+              <w:t>sign</w:t>
+            </w:r>
+            <w:r>
+              <w:rPr>
+                <w:rFonts w:ascii="Times New Roman" w:eastAsia="Times New Roman" w:hAnsi="Times New Roman" w:cs="Times New Roman"/>
+                <w:i/>
+                <w:iCs/>
+                <w:color w:val="EE0000"/>
+                <w:sz w:val="27"/>
+                <w:szCs w:val="27"/>
+              </w:rPr>
+              <w:t>_date</w:t>
             </w:r>
             <w:proofErr w:type="spellEnd"/>
             <w:r>
@@ -1594,6 +1616,7 @@
           <w:color w:val="FF0000"/>
           <w:sz w:val="26"/>
           <w:szCs w:val="26"/>
+          <w:lang w:val="vi-VN"/>
         </w:rPr>
         <w:t>employee_name</w:t>
       </w:r>
@@ -2268,6 +2291,7 @@
           <w:color w:val="FF0000"/>
           <w:sz w:val="26"/>
           <w:szCs w:val="26"/>
+          <w:lang w:val="vi-VN"/>
         </w:rPr>
         <w:t>job_title</w:t>
       </w:r>
@@ -3910,6 +3934,7 @@
           <w:i/>
           <w:sz w:val="26"/>
           <w:szCs w:val="26"/>
+          <w:lang w:val="vi-VN"/>
         </w:rPr>
       </w:pPr>
     </w:p>
@@ -3924,6 +3949,7 @@
           <w:rFonts w:ascii="Times New Roman" w:hAnsi="Times New Roman" w:cs="Times New Roman"/>
           <w:sz w:val="26"/>
           <w:szCs w:val="26"/>
+          <w:lang w:val="vi-VN"/>
         </w:rPr>
         <w:sectPr>
           <w:pgSz w:w="11907" w:h="16839" w:code="9"/>
@@ -3954,6 +3980,7 @@
           <w:rFonts w:ascii="Times New Roman" w:hAnsi="Times New Roman" w:cs="Times New Roman"/>
           <w:i/>
           <w:szCs w:val="24"/>
+          <w:lang w:val="vi-VN"/>
         </w:rPr>
       </w:pPr>
     </w:p>

</xml_diff>